<commit_message>
Added model and analysis files
</commit_message>
<xml_diff>
--- a/Project_Report.docx
+++ b/Project_Report.docx
@@ -3,95 +3,13 @@
 <w:document xmlns:wpc="http://schemas.microsoft.com/office/word/2010/wordprocessingCanvas" xmlns:cx="http://schemas.microsoft.com/office/drawing/2014/chartex" xmlns:cx1="http://schemas.microsoft.com/office/drawing/2015/9/8/chartex" xmlns:cx2="http://schemas.microsoft.com/office/drawing/2015/10/21/chartex" xmlns:cx3="http://schemas.microsoft.com/office/drawing/2016/5/9/chartex" xmlns:cx4="http://schemas.microsoft.com/office/drawing/2016/5/10/chartex" xmlns:cx5="http://schemas.microsoft.com/office/drawing/2016/5/11/chartex" xmlns:cx6="http://schemas.microsoft.com/office/drawing/2016/5/12/chartex" xmlns:cx7="http://schemas.microsoft.com/office/drawing/2016/5/13/chartex" xmlns:cx8="http://schemas.microsoft.com/office/drawing/2016/5/14/chartex" xmlns:mc="http://schemas.openxmlformats.org/markup-compatibility/2006" xmlns:aink="http://schemas.microsoft.com/office/drawing/2016/ink" xmlns:am3d="http://schemas.microsoft.com/office/drawing/2017/model3d" xmlns:o="urn:schemas-microsoft-com:office:office" xmlns:oel="http://schemas.microsoft.com/office/2019/extlst" xmlns:r="http://schemas.openxmlformats.org/officeDocument/2006/relationships" xmlns:m="http://schemas.openxmlformats.org/officeDocument/2006/math" xmlns:v="urn:schemas-microsoft-com:vml" xmlns:wp14="http://schemas.microsoft.com/office/word/2010/wordprocessingDrawing" xmlns:wp="http://schemas.openxmlformats.org/drawingml/2006/wordprocessingDrawing" xmlns:w10="urn:schemas-microsoft-com:office:word" xmlns:w="http://schemas.openxmlformats.org/wordprocessingml/2006/main" xmlns:w14="http://schemas.microsoft.com/office/word/2010/wordml" xmlns:w15="http://schemas.microsoft.com/office/word/2012/wordml" xmlns:w16cex="http://schemas.microsoft.com/office/word/2018/wordml/cex" xmlns:w16cid="http://schemas.microsoft.com/office/word/2016/wordml/cid" xmlns:w16="http://schemas.microsoft.com/office/word/2018/wordml" xmlns:w16sdtdh="http://schemas.microsoft.com/office/word/2020/wordml/sdtdatahash" xmlns:w16se="http://schemas.microsoft.com/office/word/2015/wordml/symex" xmlns:wpg="http://schemas.microsoft.com/office/word/2010/wordprocessingGroup" xmlns:wpi="http://schemas.microsoft.com/office/word/2010/wordprocessingInk" xmlns:wne="http://schemas.microsoft.com/office/word/2006/wordml" xmlns:wps="http://schemas.microsoft.com/office/word/2010/wordprocessingShape" mc:Ignorable="w14 w15 w16se w16cid w16 w16cex w16sdtdh wp14">
   <w:body>
     <w:p>
-      <w:r>
-        <w:t xml:space="preserve">Dear </w:t>
-      </w:r>
-      <w:r>
-        <w:t>Aspirer,</w:t>
-      </w:r>
-    </w:p>
-    <w:p>
       <w:pPr>
         <w:jc w:val="both"/>
-      </w:pPr>
-      <w:r>
-        <w:t xml:space="preserve">Project report is an inherent component of your </w:t>
-      </w:r>
-      <w:r>
-        <w:t>Industry Project</w:t>
-      </w:r>
-      <w:r>
-        <w:t xml:space="preserve">. </w:t>
-      </w:r>
-      <w:r>
-        <w:t xml:space="preserve">We are enclosing a reference table of content for the project report. Depending on the </w:t>
-      </w:r>
-      <w:r>
-        <w:t>Industry</w:t>
-      </w:r>
-      <w:r>
-        <w:t xml:space="preserve"> project</w:t>
-      </w:r>
-      <w:r>
-        <w:t>,</w:t>
-      </w:r>
-      <w:r>
-        <w:t xml:space="preserve"> you may </w:t>
-      </w:r>
-      <w:r>
-        <w:t xml:space="preserve">choose to </w:t>
-      </w:r>
-      <w:r>
-        <w:t>include</w:t>
-      </w:r>
-      <w:r>
-        <w:t xml:space="preserve"> or </w:t>
-      </w:r>
-      <w:r>
-        <w:t xml:space="preserve">exclude </w:t>
-      </w:r>
-      <w:r>
-        <w:t xml:space="preserve">or rename sections </w:t>
-      </w:r>
-      <w:r>
-        <w:t xml:space="preserve">from the </w:t>
-      </w:r>
-      <w:r>
-        <w:t>T</w:t>
-      </w:r>
-      <w:r>
-        <w:t xml:space="preserve">able of </w:t>
-      </w:r>
-      <w:r>
-        <w:t>C</w:t>
-      </w:r>
-      <w:r>
-        <w:t>ontent</w:t>
-      </w:r>
-      <w:r>
-        <w:t xml:space="preserve"> mentioned below</w:t>
-      </w:r>
-      <w:r>
-        <w:t>.</w:t>
-      </w:r>
-      <w:r>
-        <w:t xml:space="preserve"> You can also </w:t>
-      </w:r>
-      <w:r>
-        <w:t>showcase your creativity to present the report</w:t>
-      </w:r>
-      <w:r>
-        <w:t xml:space="preserve">. The key objective of this report is for you to </w:t>
-      </w:r>
-      <w:r>
-        <w:t>comprehensively</w:t>
-      </w:r>
-      <w:r>
-        <w:t xml:space="preserve"> document the project work done.</w:t>
-      </w:r>
-      <w:r>
-        <w:t xml:space="preserve"> </w:t>
-      </w:r>
+        <w:rPr>
+          <w:sz w:val="24"/>
+          <w:szCs w:val="24"/>
+        </w:rPr>
+      </w:pPr>
     </w:p>
     <w:tbl>
       <w:tblPr>
@@ -109,16 +27,38 @@
             <w:tcW w:w="3235" w:type="dxa"/>
           </w:tcPr>
           <w:p>
+            <w:pPr>
+              <w:rPr>
+                <w:sz w:val="24"/>
+                <w:szCs w:val="24"/>
+              </w:rPr>
+            </w:pPr>
             <w:r>
+              <w:rPr>
+                <w:sz w:val="24"/>
+                <w:szCs w:val="24"/>
+              </w:rPr>
               <w:t>Industry</w:t>
             </w:r>
             <w:r>
+              <w:rPr>
+                <w:sz w:val="24"/>
+                <w:szCs w:val="24"/>
+              </w:rPr>
               <w:t xml:space="preserve"> </w:t>
             </w:r>
             <w:r>
+              <w:rPr>
+                <w:sz w:val="24"/>
+                <w:szCs w:val="24"/>
+              </w:rPr>
               <w:t>Project T</w:t>
             </w:r>
             <w:r>
+              <w:rPr>
+                <w:sz w:val="24"/>
+                <w:szCs w:val="24"/>
+              </w:rPr>
               <w:t>itle</w:t>
             </w:r>
           </w:p>
@@ -128,7 +68,17 @@
             <w:tcW w:w="6115" w:type="dxa"/>
           </w:tcPr>
           <w:p>
+            <w:pPr>
+              <w:rPr>
+                <w:sz w:val="24"/>
+                <w:szCs w:val="24"/>
+              </w:rPr>
+            </w:pPr>
             <w:r>
+              <w:rPr>
+                <w:sz w:val="24"/>
+                <w:szCs w:val="24"/>
+              </w:rPr>
               <w:t>Integrated Retail Sales Performance Tracking and Analysis</w:t>
             </w:r>
           </w:p>
@@ -140,7 +90,17 @@
             <w:tcW w:w="3235" w:type="dxa"/>
           </w:tcPr>
           <w:p>
+            <w:pPr>
+              <w:rPr>
+                <w:sz w:val="24"/>
+                <w:szCs w:val="24"/>
+              </w:rPr>
+            </w:pPr>
             <w:r>
+              <w:rPr>
+                <w:sz w:val="24"/>
+                <w:szCs w:val="24"/>
+              </w:rPr>
               <w:t>Name of the Company</w:t>
             </w:r>
           </w:p>
@@ -150,9 +110,28 @@
             <w:tcW w:w="6115" w:type="dxa"/>
           </w:tcPr>
           <w:p>
+            <w:pPr>
+              <w:rPr>
+                <w:sz w:val="24"/>
+                <w:szCs w:val="24"/>
+              </w:rPr>
+            </w:pPr>
             <w:r>
-              <w:t>TCS iON</w:t>
+              <w:rPr>
+                <w:sz w:val="24"/>
+                <w:szCs w:val="24"/>
+              </w:rPr>
+              <w:t xml:space="preserve">TCS </w:t>
             </w:r>
+            <w:proofErr w:type="spellStart"/>
+            <w:r>
+              <w:rPr>
+                <w:sz w:val="24"/>
+                <w:szCs w:val="24"/>
+              </w:rPr>
+              <w:t>iON</w:t>
+            </w:r>
+            <w:proofErr w:type="spellEnd"/>
           </w:p>
         </w:tc>
       </w:tr>
@@ -162,7 +141,17 @@
             <w:tcW w:w="3235" w:type="dxa"/>
           </w:tcPr>
           <w:p>
+            <w:pPr>
+              <w:rPr>
+                <w:sz w:val="24"/>
+                <w:szCs w:val="24"/>
+              </w:rPr>
+            </w:pPr>
             <w:r>
+              <w:rPr>
+                <w:sz w:val="24"/>
+                <w:szCs w:val="24"/>
+              </w:rPr>
               <w:t>Name of the Institute</w:t>
             </w:r>
           </w:p>
@@ -172,14 +161,31 @@
             <w:tcW w:w="6115" w:type="dxa"/>
           </w:tcPr>
           <w:p>
+            <w:pPr>
+              <w:rPr>
+                <w:sz w:val="24"/>
+                <w:szCs w:val="24"/>
+              </w:rPr>
+            </w:pPr>
             <w:r>
+              <w:rPr>
+                <w:sz w:val="24"/>
+                <w:szCs w:val="24"/>
+              </w:rPr>
               <w:t>Vishwakarma University</w:t>
             </w:r>
           </w:p>
         </w:tc>
       </w:tr>
     </w:tbl>
-    <w:p/>
+    <w:p>
+      <w:pPr>
+        <w:rPr>
+          <w:sz w:val="24"/>
+          <w:szCs w:val="24"/>
+        </w:rPr>
+      </w:pPr>
+    </w:p>
     <w:tbl>
       <w:tblPr>
         <w:tblStyle w:val="TableGrid"/>
@@ -199,7 +205,17 @@
             <w:tcW w:w="1615" w:type="dxa"/>
           </w:tcPr>
           <w:p>
+            <w:pPr>
+              <w:rPr>
+                <w:sz w:val="24"/>
+                <w:szCs w:val="24"/>
+              </w:rPr>
+            </w:pPr>
             <w:r>
+              <w:rPr>
+                <w:sz w:val="24"/>
+                <w:szCs w:val="24"/>
+              </w:rPr>
               <w:t>Start Date</w:t>
             </w:r>
           </w:p>
@@ -209,7 +225,17 @@
             <w:tcW w:w="1620" w:type="dxa"/>
           </w:tcPr>
           <w:p>
+            <w:pPr>
+              <w:rPr>
+                <w:sz w:val="24"/>
+                <w:szCs w:val="24"/>
+              </w:rPr>
+            </w:pPr>
             <w:r>
+              <w:rPr>
+                <w:sz w:val="24"/>
+                <w:szCs w:val="24"/>
+              </w:rPr>
               <w:t>End Date</w:t>
             </w:r>
           </w:p>
@@ -219,7 +245,17 @@
             <w:tcW w:w="1800" w:type="dxa"/>
           </w:tcPr>
           <w:p>
+            <w:pPr>
+              <w:rPr>
+                <w:sz w:val="24"/>
+                <w:szCs w:val="24"/>
+              </w:rPr>
+            </w:pPr>
             <w:r>
+              <w:rPr>
+                <w:sz w:val="24"/>
+                <w:szCs w:val="24"/>
+              </w:rPr>
               <w:t>Total Effort (hrs.)</w:t>
             </w:r>
           </w:p>
@@ -229,7 +265,17 @@
             <w:tcW w:w="2250" w:type="dxa"/>
           </w:tcPr>
           <w:p>
+            <w:pPr>
+              <w:rPr>
+                <w:sz w:val="24"/>
+                <w:szCs w:val="24"/>
+              </w:rPr>
+            </w:pPr>
             <w:r>
+              <w:rPr>
+                <w:sz w:val="24"/>
+                <w:szCs w:val="24"/>
+              </w:rPr>
               <w:t>Project Environment</w:t>
             </w:r>
           </w:p>
@@ -239,7 +285,17 @@
             <w:tcW w:w="2065" w:type="dxa"/>
           </w:tcPr>
           <w:p>
+            <w:pPr>
+              <w:rPr>
+                <w:sz w:val="24"/>
+                <w:szCs w:val="24"/>
+              </w:rPr>
+            </w:pPr>
             <w:r>
+              <w:rPr>
+                <w:sz w:val="24"/>
+                <w:szCs w:val="24"/>
+              </w:rPr>
               <w:t>Tools used</w:t>
             </w:r>
           </w:p>
@@ -250,21 +306,66 @@
           <w:tcPr>
             <w:tcW w:w="1615" w:type="dxa"/>
           </w:tcPr>
-          <w:p/>
+          <w:p>
+            <w:pPr>
+              <w:rPr>
+                <w:sz w:val="24"/>
+                <w:szCs w:val="24"/>
+              </w:rPr>
+            </w:pPr>
+            <w:r>
+              <w:rPr>
+                <w:sz w:val="24"/>
+                <w:szCs w:val="24"/>
+              </w:rPr>
+              <w:t>01-04-2026</w:t>
+            </w:r>
+          </w:p>
         </w:tc>
         <w:tc>
           <w:tcPr>
             <w:tcW w:w="1620" w:type="dxa"/>
           </w:tcPr>
-          <w:p/>
+          <w:p>
+            <w:pPr>
+              <w:rPr>
+                <w:sz w:val="24"/>
+                <w:szCs w:val="24"/>
+              </w:rPr>
+            </w:pPr>
+            <w:r>
+              <w:rPr>
+                <w:sz w:val="24"/>
+                <w:szCs w:val="24"/>
+              </w:rPr>
+              <w:t>11-04-2026</w:t>
+            </w:r>
+          </w:p>
         </w:tc>
         <w:tc>
           <w:tcPr>
             <w:tcW w:w="1800" w:type="dxa"/>
           </w:tcPr>
           <w:p>
+            <w:pPr>
+              <w:rPr>
+                <w:sz w:val="24"/>
+                <w:szCs w:val="24"/>
+              </w:rPr>
+            </w:pPr>
             <w:r>
-              <w:t>40 Hrs</w:t>
+              <w:rPr>
+                <w:sz w:val="24"/>
+                <w:szCs w:val="24"/>
+              </w:rPr>
+              <w:t xml:space="preserve">40 </w:t>
+            </w:r>
+            <w:r>
+              <w:rPr>
+                <w:sz w:val="24"/>
+                <w:szCs w:val="24"/>
+              </w:rPr>
+              <w:t>Hrs.</w:t>
             </w:r>
           </w:p>
         </w:tc>
@@ -273,7 +374,17 @@
             <w:tcW w:w="2250" w:type="dxa"/>
           </w:tcPr>
           <w:p>
+            <w:pPr>
+              <w:rPr>
+                <w:sz w:val="24"/>
+                <w:szCs w:val="24"/>
+              </w:rPr>
+            </w:pPr>
             <w:r>
+              <w:rPr>
+                <w:sz w:val="24"/>
+                <w:szCs w:val="24"/>
+              </w:rPr>
               <w:t>Windows</w:t>
             </w:r>
           </w:p>
@@ -283,21 +394,40 @@
             <w:tcW w:w="2065" w:type="dxa"/>
           </w:tcPr>
           <w:p>
+            <w:pPr>
+              <w:rPr>
+                <w:sz w:val="24"/>
+                <w:szCs w:val="24"/>
+              </w:rPr>
+            </w:pPr>
             <w:r>
-              <w:t xml:space="preserve">- </w:t>
+              <w:rPr>
+                <w:sz w:val="24"/>
+                <w:szCs w:val="24"/>
+              </w:rPr>
+              <w:t>- Python (Pandas, Matplotlib)</w:t>
             </w:r>
             <w:r>
-              <w:t>Python (Pandas, Matplotlib)</w:t>
-            </w:r>
-            <w:r>
+              <w:rPr>
+                <w:sz w:val="24"/>
+                <w:szCs w:val="24"/>
+              </w:rPr>
               <w:br/>
               <w:t>- Power BI</w:t>
             </w:r>
             <w:r>
+              <w:rPr>
+                <w:sz w:val="24"/>
+                <w:szCs w:val="24"/>
+              </w:rPr>
               <w:br/>
               <w:t>- Excel</w:t>
             </w:r>
             <w:r>
+              <w:rPr>
+                <w:sz w:val="24"/>
+                <w:szCs w:val="24"/>
+              </w:rPr>
               <w:br/>
               <w:t>- Kaggle Dataset</w:t>
             </w:r>
@@ -305,18 +435,29 @@
         </w:tc>
       </w:tr>
     </w:tbl>
-    <w:p/>
+    <w:p>
+      <w:pPr>
+        <w:rPr>
+          <w:sz w:val="24"/>
+          <w:szCs w:val="24"/>
+        </w:rPr>
+      </w:pPr>
+    </w:p>
     <w:p>
       <w:pPr>
         <w:rPr>
           <w:b/>
           <w:bCs/>
+          <w:sz w:val="24"/>
+          <w:szCs w:val="24"/>
         </w:rPr>
       </w:pPr>
       <w:r>
         <w:rPr>
           <w:b/>
           <w:bCs/>
+          <w:sz w:val="24"/>
+          <w:szCs w:val="24"/>
         </w:rPr>
         <w:t>TABLE OF CONTENT</w:t>
       </w:r>
@@ -328,17 +469,31 @@
           <w:ilvl w:val="0"/>
           <w:numId w:val="1"/>
         </w:numPr>
-      </w:pPr>
-      <w:r>
+        <w:rPr>
+          <w:sz w:val="24"/>
+          <w:szCs w:val="24"/>
+        </w:rPr>
+      </w:pPr>
+      <w:r>
+        <w:rPr>
+          <w:sz w:val="24"/>
+          <w:szCs w:val="24"/>
+        </w:rPr>
         <w:t>Acknowledgements</w:t>
       </w:r>
       <w:r>
         <w:rPr>
+          <w:sz w:val="24"/>
+          <w:szCs w:val="24"/>
           <w:lang w:val="en-IN"/>
         </w:rPr>
         <w:t> </w:t>
       </w:r>
       <w:r>
+        <w:rPr>
+          <w:sz w:val="24"/>
+          <w:szCs w:val="24"/>
+        </w:rPr>
         <w:t> </w:t>
       </w:r>
     </w:p>
@@ -349,17 +504,31 @@
           <w:ilvl w:val="0"/>
           <w:numId w:val="1"/>
         </w:numPr>
-      </w:pPr>
-      <w:r>
+        <w:rPr>
+          <w:sz w:val="24"/>
+          <w:szCs w:val="24"/>
+        </w:rPr>
+      </w:pPr>
+      <w:r>
+        <w:rPr>
+          <w:sz w:val="24"/>
+          <w:szCs w:val="24"/>
+        </w:rPr>
         <w:t>Objective</w:t>
       </w:r>
       <w:r>
         <w:rPr>
+          <w:sz w:val="24"/>
+          <w:szCs w:val="24"/>
           <w:lang w:val="en-IN"/>
         </w:rPr>
         <w:t> and Scope</w:t>
       </w:r>
       <w:r>
+        <w:rPr>
+          <w:sz w:val="24"/>
+          <w:szCs w:val="24"/>
+        </w:rPr>
         <w:t> </w:t>
       </w:r>
     </w:p>
@@ -370,8 +539,16 @@
           <w:ilvl w:val="0"/>
           <w:numId w:val="1"/>
         </w:numPr>
-      </w:pPr>
-      <w:r>
+        <w:rPr>
+          <w:sz w:val="24"/>
+          <w:szCs w:val="24"/>
+        </w:rPr>
+      </w:pPr>
+      <w:r>
+        <w:rPr>
+          <w:sz w:val="24"/>
+          <w:szCs w:val="24"/>
+        </w:rPr>
         <w:t>Problem Statement </w:t>
       </w:r>
     </w:p>
@@ -382,8 +559,16 @@
           <w:ilvl w:val="0"/>
           <w:numId w:val="1"/>
         </w:numPr>
-      </w:pPr>
-      <w:r>
+        <w:rPr>
+          <w:sz w:val="24"/>
+          <w:szCs w:val="24"/>
+        </w:rPr>
+      </w:pPr>
+      <w:r>
+        <w:rPr>
+          <w:sz w:val="24"/>
+          <w:szCs w:val="24"/>
+        </w:rPr>
         <w:t>Existing Approaches </w:t>
       </w:r>
     </w:p>
@@ -394,15 +579,29 @@
           <w:ilvl w:val="0"/>
           <w:numId w:val="1"/>
         </w:numPr>
-      </w:pPr>
-      <w:r>
+        <w:rPr>
+          <w:sz w:val="24"/>
+          <w:szCs w:val="24"/>
+        </w:rPr>
+      </w:pPr>
+      <w:r>
+        <w:rPr>
+          <w:sz w:val="24"/>
+          <w:szCs w:val="24"/>
+        </w:rPr>
         <w:t>Approach / Methodology</w:t>
       </w:r>
       <w:r>
+        <w:rPr>
+          <w:sz w:val="24"/>
+          <w:szCs w:val="24"/>
+        </w:rPr>
         <w:t xml:space="preserve"> - </w:t>
       </w:r>
       <w:r>
         <w:rPr>
+          <w:sz w:val="24"/>
+          <w:szCs w:val="24"/>
           <w:lang w:val="en-IN"/>
         </w:rPr>
         <w:t>Tools and Technologies used</w:t>
@@ -415,14 +614,24 @@
           <w:ilvl w:val="0"/>
           <w:numId w:val="1"/>
         </w:numPr>
-      </w:pPr>
-      <w:r>
-        <w:rPr>
+        <w:rPr>
+          <w:sz w:val="24"/>
+          <w:szCs w:val="24"/>
+        </w:rPr>
+      </w:pPr>
+      <w:r>
+        <w:rPr>
+          <w:sz w:val="24"/>
+          <w:szCs w:val="24"/>
           <w:lang w:val="en-IN"/>
         </w:rPr>
         <w:t>Workflow</w:t>
       </w:r>
       <w:r>
+        <w:rPr>
+          <w:sz w:val="24"/>
+          <w:szCs w:val="24"/>
+        </w:rPr>
         <w:t> </w:t>
       </w:r>
     </w:p>
@@ -433,17 +642,31 @@
           <w:ilvl w:val="0"/>
           <w:numId w:val="1"/>
         </w:numPr>
-      </w:pPr>
-      <w:r>
+        <w:rPr>
+          <w:sz w:val="24"/>
+          <w:szCs w:val="24"/>
+        </w:rPr>
+      </w:pPr>
+      <w:r>
+        <w:rPr>
+          <w:sz w:val="24"/>
+          <w:szCs w:val="24"/>
+        </w:rPr>
         <w:t>Assumptions</w:t>
       </w:r>
       <w:r>
         <w:rPr>
+          <w:sz w:val="24"/>
+          <w:szCs w:val="24"/>
           <w:lang w:val="en-IN"/>
         </w:rPr>
         <w:t> </w:t>
       </w:r>
       <w:r>
+        <w:rPr>
+          <w:sz w:val="24"/>
+          <w:szCs w:val="24"/>
+        </w:rPr>
         <w:t> </w:t>
       </w:r>
     </w:p>
@@ -454,26 +677,40 @@
           <w:ilvl w:val="0"/>
           <w:numId w:val="1"/>
         </w:numPr>
-      </w:pPr>
-      <w:r>
-        <w:rPr>
+        <w:rPr>
+          <w:sz w:val="24"/>
+          <w:szCs w:val="24"/>
+        </w:rPr>
+      </w:pPr>
+      <w:r>
+        <w:rPr>
+          <w:sz w:val="24"/>
+          <w:szCs w:val="24"/>
           <w:lang w:val="en-IN"/>
         </w:rPr>
         <w:t>Implementation</w:t>
       </w:r>
       <w:r>
         <w:rPr>
+          <w:sz w:val="24"/>
+          <w:szCs w:val="24"/>
           <w:lang w:val="en-IN"/>
         </w:rPr>
         <w:t xml:space="preserve"> - </w:t>
       </w:r>
       <w:r>
         <w:rPr>
+          <w:sz w:val="24"/>
+          <w:szCs w:val="24"/>
           <w:lang w:val="en-IN"/>
         </w:rPr>
         <w:t>Data collection, Processing Steps, Diagrams -</w:t>
       </w:r>
       <w:r>
+        <w:rPr>
+          <w:sz w:val="24"/>
+          <w:szCs w:val="24"/>
+        </w:rPr>
         <w:t xml:space="preserve"> Charts, Table</w:t>
       </w:r>
     </w:p>
@@ -484,9 +721,15 @@
           <w:ilvl w:val="0"/>
           <w:numId w:val="1"/>
         </w:numPr>
-      </w:pPr>
-      <w:r>
-        <w:rPr>
+        <w:rPr>
+          <w:sz w:val="24"/>
+          <w:szCs w:val="24"/>
+        </w:rPr>
+      </w:pPr>
+      <w:r>
+        <w:rPr>
+          <w:sz w:val="24"/>
+          <w:szCs w:val="24"/>
           <w:lang w:val="en-IN"/>
         </w:rPr>
         <w:t>Solution Design</w:t>
@@ -499,17 +742,31 @@
           <w:ilvl w:val="0"/>
           <w:numId w:val="1"/>
         </w:numPr>
-      </w:pPr>
-      <w:r>
+        <w:rPr>
+          <w:sz w:val="24"/>
+          <w:szCs w:val="24"/>
+        </w:rPr>
+      </w:pPr>
+      <w:r>
+        <w:rPr>
+          <w:sz w:val="24"/>
+          <w:szCs w:val="24"/>
+        </w:rPr>
         <w:t>Challenges &amp; Opportunities</w:t>
       </w:r>
       <w:r>
         <w:rPr>
+          <w:sz w:val="24"/>
+          <w:szCs w:val="24"/>
           <w:lang w:val="en-IN"/>
         </w:rPr>
         <w:t> </w:t>
       </w:r>
       <w:r>
+        <w:rPr>
+          <w:sz w:val="24"/>
+          <w:szCs w:val="24"/>
+        </w:rPr>
         <w:t> </w:t>
       </w:r>
     </w:p>
@@ -520,17 +777,31 @@
           <w:ilvl w:val="0"/>
           <w:numId w:val="1"/>
         </w:numPr>
-      </w:pPr>
-      <w:r>
+        <w:rPr>
+          <w:sz w:val="24"/>
+          <w:szCs w:val="24"/>
+        </w:rPr>
+      </w:pPr>
+      <w:r>
+        <w:rPr>
+          <w:sz w:val="24"/>
+          <w:szCs w:val="24"/>
+        </w:rPr>
         <w:t>Reflections on the project</w:t>
       </w:r>
       <w:r>
         <w:rPr>
+          <w:sz w:val="24"/>
+          <w:szCs w:val="24"/>
           <w:lang w:val="en-IN"/>
         </w:rPr>
         <w:t> </w:t>
       </w:r>
       <w:r>
+        <w:rPr>
+          <w:sz w:val="24"/>
+          <w:szCs w:val="24"/>
+        </w:rPr>
         <w:t> </w:t>
       </w:r>
     </w:p>
@@ -541,17 +812,31 @@
           <w:ilvl w:val="0"/>
           <w:numId w:val="1"/>
         </w:numPr>
-      </w:pPr>
-      <w:r>
+        <w:rPr>
+          <w:sz w:val="24"/>
+          <w:szCs w:val="24"/>
+        </w:rPr>
+      </w:pPr>
+      <w:r>
+        <w:rPr>
+          <w:sz w:val="24"/>
+          <w:szCs w:val="24"/>
+        </w:rPr>
         <w:t>Recommendations</w:t>
       </w:r>
       <w:r>
         <w:rPr>
+          <w:sz w:val="24"/>
+          <w:szCs w:val="24"/>
           <w:lang w:val="en-IN"/>
         </w:rPr>
         <w:t> </w:t>
       </w:r>
       <w:r>
+        <w:rPr>
+          <w:sz w:val="24"/>
+          <w:szCs w:val="24"/>
+        </w:rPr>
         <w:t> </w:t>
       </w:r>
     </w:p>
@@ -562,17 +847,31 @@
           <w:ilvl w:val="0"/>
           <w:numId w:val="1"/>
         </w:numPr>
-      </w:pPr>
-      <w:r>
+        <w:rPr>
+          <w:sz w:val="24"/>
+          <w:szCs w:val="24"/>
+        </w:rPr>
+      </w:pPr>
+      <w:r>
+        <w:rPr>
+          <w:sz w:val="24"/>
+          <w:szCs w:val="24"/>
+        </w:rPr>
         <w:t>Outcome / Conclusion</w:t>
       </w:r>
       <w:r>
         <w:rPr>
+          <w:sz w:val="24"/>
+          <w:szCs w:val="24"/>
           <w:lang w:val="en-IN"/>
         </w:rPr>
         <w:t> </w:t>
       </w:r>
       <w:r>
+        <w:rPr>
+          <w:sz w:val="24"/>
+          <w:szCs w:val="24"/>
+        </w:rPr>
         <w:t> </w:t>
       </w:r>
     </w:p>
@@ -583,17 +882,31 @@
           <w:ilvl w:val="0"/>
           <w:numId w:val="1"/>
         </w:numPr>
-      </w:pPr>
-      <w:r>
+        <w:rPr>
+          <w:sz w:val="24"/>
+          <w:szCs w:val="24"/>
+        </w:rPr>
+      </w:pPr>
+      <w:r>
+        <w:rPr>
+          <w:sz w:val="24"/>
+          <w:szCs w:val="24"/>
+        </w:rPr>
         <w:t>Enhancement Scope</w:t>
       </w:r>
       <w:r>
         <w:rPr>
+          <w:sz w:val="24"/>
+          <w:szCs w:val="24"/>
           <w:lang w:val="en-IN"/>
         </w:rPr>
         <w:t> </w:t>
       </w:r>
       <w:r>
+        <w:rPr>
+          <w:sz w:val="24"/>
+          <w:szCs w:val="24"/>
+        </w:rPr>
         <w:t> </w:t>
       </w:r>
     </w:p>
@@ -604,17 +917,31 @@
           <w:ilvl w:val="0"/>
           <w:numId w:val="1"/>
         </w:numPr>
-      </w:pPr>
-      <w:r>
+        <w:rPr>
+          <w:sz w:val="24"/>
+          <w:szCs w:val="24"/>
+        </w:rPr>
+      </w:pPr>
+      <w:r>
+        <w:rPr>
+          <w:sz w:val="24"/>
+          <w:szCs w:val="24"/>
+        </w:rPr>
         <w:t>Link to code and executable file</w:t>
       </w:r>
       <w:r>
         <w:rPr>
+          <w:sz w:val="24"/>
+          <w:szCs w:val="24"/>
           <w:lang w:val="en-IN"/>
         </w:rPr>
         <w:t> </w:t>
       </w:r>
       <w:r>
+        <w:rPr>
+          <w:sz w:val="24"/>
+          <w:szCs w:val="24"/>
+        </w:rPr>
         <w:t> </w:t>
       </w:r>
     </w:p>
@@ -625,17 +952,31 @@
           <w:ilvl w:val="0"/>
           <w:numId w:val="1"/>
         </w:numPr>
-      </w:pPr>
-      <w:r>
+        <w:rPr>
+          <w:sz w:val="24"/>
+          <w:szCs w:val="24"/>
+        </w:rPr>
+      </w:pPr>
+      <w:r>
+        <w:rPr>
+          <w:sz w:val="24"/>
+          <w:szCs w:val="24"/>
+        </w:rPr>
         <w:t>Research questions and responses</w:t>
       </w:r>
       <w:r>
         <w:rPr>
+          <w:sz w:val="24"/>
+          <w:szCs w:val="24"/>
           <w:lang w:val="en-IN"/>
         </w:rPr>
         <w:t> </w:t>
       </w:r>
       <w:r>
+        <w:rPr>
+          <w:sz w:val="24"/>
+          <w:szCs w:val="24"/>
+        </w:rPr>
         <w:t> </w:t>
       </w:r>
     </w:p>
@@ -646,31 +987,75 @@
           <w:ilvl w:val="0"/>
           <w:numId w:val="1"/>
         </w:numPr>
-      </w:pPr>
-      <w:r>
-        <w:rPr>
+        <w:rPr>
+          <w:sz w:val="24"/>
+          <w:szCs w:val="24"/>
+        </w:rPr>
+      </w:pPr>
+      <w:r>
+        <w:rPr>
+          <w:sz w:val="24"/>
+          <w:szCs w:val="24"/>
           <w:lang w:val="en-IN"/>
         </w:rPr>
         <w:t>References </w:t>
       </w:r>
       <w:r>
+        <w:rPr>
+          <w:sz w:val="24"/>
+          <w:szCs w:val="24"/>
+        </w:rPr>
         <w:t> </w:t>
       </w:r>
     </w:p>
     <w:p>
       <w:pPr>
         <w:pStyle w:val="ListParagraph"/>
-      </w:pPr>
-    </w:p>
-    <w:p/>
-    <w:p/>
-    <w:p/>
-    <w:p/>
+        <w:rPr>
+          <w:sz w:val="24"/>
+          <w:szCs w:val="24"/>
+        </w:rPr>
+      </w:pPr>
+    </w:p>
+    <w:p>
+      <w:pPr>
+        <w:rPr>
+          <w:sz w:val="24"/>
+          <w:szCs w:val="24"/>
+        </w:rPr>
+      </w:pPr>
+    </w:p>
+    <w:p>
+      <w:pPr>
+        <w:rPr>
+          <w:sz w:val="24"/>
+          <w:szCs w:val="24"/>
+        </w:rPr>
+      </w:pPr>
+    </w:p>
+    <w:p>
+      <w:pPr>
+        <w:rPr>
+          <w:sz w:val="24"/>
+          <w:szCs w:val="24"/>
+        </w:rPr>
+      </w:pPr>
+    </w:p>
+    <w:p>
+      <w:pPr>
+        <w:rPr>
+          <w:sz w:val="24"/>
+          <w:szCs w:val="24"/>
+        </w:rPr>
+      </w:pPr>
+    </w:p>
     <w:p>
       <w:pPr>
         <w:rPr>
           <w:b/>
           <w:bCs/>
+          <w:sz w:val="28"/>
+          <w:szCs w:val="28"/>
           <w:lang w:val="en-IN"/>
         </w:rPr>
       </w:pPr>
@@ -679,14 +1064,19 @@
           <w:rFonts w:ascii="Segoe UI Emoji" w:hAnsi="Segoe UI Emoji" w:cs="Segoe UI Emoji"/>
           <w:b/>
           <w:bCs/>
-          <w:lang w:val="en-IN"/>
-        </w:rPr>
+          <w:sz w:val="28"/>
+          <w:szCs w:val="28"/>
+          <w:lang w:val="en-IN"/>
+        </w:rPr>
+        <w:lastRenderedPageBreak/>
         <w:t>🟩</w:t>
       </w:r>
       <w:r>
         <w:rPr>
           <w:b/>
           <w:bCs/>
+          <w:sz w:val="28"/>
+          <w:szCs w:val="28"/>
           <w:lang w:val="en-IN"/>
         </w:rPr>
         <w:t xml:space="preserve"> Acknowledgement</w:t>
@@ -695,28 +1085,54 @@
     <w:p>
       <w:pPr>
         <w:rPr>
-          <w:lang w:val="en-IN"/>
-        </w:rPr>
-      </w:pPr>
-      <w:r>
-        <w:rPr>
-          <w:lang w:val="en-IN"/>
-        </w:rPr>
-        <w:t>I would like to express my sincere gratitude to TCS iON for providing this opportunity to work on the industry project. I also thank my mentors and instructors for their guidance and support throughout the project. This project helped me gain practical knowledge in data analytics and visualization.</w:t>
-      </w:r>
-    </w:p>
-    <w:p>
-      <w:pPr>
-        <w:rPr>
-          <w:lang w:val="en-IN"/>
-        </w:rPr>
-      </w:pPr>
-      <w:r>
-        <w:rPr>
+          <w:sz w:val="28"/>
+          <w:szCs w:val="28"/>
+          <w:lang w:val="en-IN"/>
+        </w:rPr>
+      </w:pPr>
+      <w:r>
+        <w:rPr>
+          <w:sz w:val="28"/>
+          <w:szCs w:val="28"/>
+          <w:lang w:val="en-IN"/>
+        </w:rPr>
+        <w:t xml:space="preserve">I would like to express my sincere gratitude to TCS </w:t>
+      </w:r>
+      <w:proofErr w:type="spellStart"/>
+      <w:r>
+        <w:rPr>
+          <w:sz w:val="28"/>
+          <w:szCs w:val="28"/>
+          <w:lang w:val="en-IN"/>
+        </w:rPr>
+        <w:t>iON</w:t>
+      </w:r>
+      <w:proofErr w:type="spellEnd"/>
+      <w:r>
+        <w:rPr>
+          <w:sz w:val="28"/>
+          <w:szCs w:val="28"/>
+          <w:lang w:val="en-IN"/>
+        </w:rPr>
+        <w:t xml:space="preserve"> for providing this opportunity to work on the industry project. I also thank my mentors and instructors for their guidance and support throughout the project. This project helped me gain practical knowledge in data analytics and visualization.</w:t>
+      </w:r>
+    </w:p>
+    <w:p>
+      <w:pPr>
+        <w:rPr>
+          <w:sz w:val="28"/>
+          <w:szCs w:val="28"/>
+          <w:lang w:val="en-IN"/>
+        </w:rPr>
+      </w:pPr>
+      <w:r>
+        <w:rPr>
+          <w:sz w:val="28"/>
+          <w:szCs w:val="28"/>
           <w:lang w:val="en-IN"/>
         </w:rPr>
         <w:pict w14:anchorId="4FF4E82E">
-          <v:rect id="_x0000_i1137" style="width:0;height:1.5pt" o:hralign="center" o:hrstd="t" o:hr="t" fillcolor="#a0a0a0" stroked="f"/>
+          <v:rect id="_x0000_i1025" style="width:0;height:1.5pt" o:hralign="center" o:hrstd="t" o:hr="t" fillcolor="#a0a0a0" stroked="f"/>
         </w:pict>
       </w:r>
     </w:p>
@@ -725,6 +1141,8 @@
         <w:rPr>
           <w:b/>
           <w:bCs/>
+          <w:sz w:val="28"/>
+          <w:szCs w:val="28"/>
           <w:lang w:val="en-IN"/>
         </w:rPr>
       </w:pPr>
@@ -733,6 +1151,8 @@
           <w:rFonts w:ascii="Segoe UI Emoji" w:hAnsi="Segoe UI Emoji" w:cs="Segoe UI Emoji"/>
           <w:b/>
           <w:bCs/>
+          <w:sz w:val="28"/>
+          <w:szCs w:val="28"/>
           <w:lang w:val="en-IN"/>
         </w:rPr>
         <w:t>🟩</w:t>
@@ -741,6 +1161,8 @@
         <w:rPr>
           <w:b/>
           <w:bCs/>
+          <w:sz w:val="28"/>
+          <w:szCs w:val="28"/>
           <w:lang w:val="en-IN"/>
         </w:rPr>
         <w:t xml:space="preserve"> Objective and Scope</w:t>
@@ -749,28 +1171,54 @@
     <w:p>
       <w:pPr>
         <w:rPr>
-          <w:lang w:val="en-IN"/>
-        </w:rPr>
-      </w:pPr>
-      <w:r>
-        <w:rPr>
-          <w:lang w:val="en-IN"/>
-        </w:rPr>
-        <w:t>The objective of this project is to develop a Retail Sales Performance Monitoring System that helps in analyzing sales data, identifying trends, and generating insights. The scope includes data preprocessing, analysis, visualization, and dashboard creation using Python and Power BI.</w:t>
-      </w:r>
-    </w:p>
-    <w:p>
-      <w:pPr>
-        <w:rPr>
-          <w:lang w:val="en-IN"/>
-        </w:rPr>
-      </w:pPr>
-      <w:r>
-        <w:rPr>
+          <w:sz w:val="28"/>
+          <w:szCs w:val="28"/>
+          <w:lang w:val="en-IN"/>
+        </w:rPr>
+      </w:pPr>
+      <w:r>
+        <w:rPr>
+          <w:sz w:val="28"/>
+          <w:szCs w:val="28"/>
+          <w:lang w:val="en-IN"/>
+        </w:rPr>
+        <w:t xml:space="preserve">The objective of this project is to develop a Retail Sales Performance Monitoring System that helps in </w:t>
+      </w:r>
+      <w:proofErr w:type="spellStart"/>
+      <w:r>
+        <w:rPr>
+          <w:sz w:val="28"/>
+          <w:szCs w:val="28"/>
+          <w:lang w:val="en-IN"/>
+        </w:rPr>
+        <w:t>analyzing</w:t>
+      </w:r>
+      <w:proofErr w:type="spellEnd"/>
+      <w:r>
+        <w:rPr>
+          <w:sz w:val="28"/>
+          <w:szCs w:val="28"/>
+          <w:lang w:val="en-IN"/>
+        </w:rPr>
+        <w:t xml:space="preserve"> sales data, identifying trends, and generating insights. The scope includes data preprocessing, analysis, visualization, and dashboard creation using Python and Power BI.</w:t>
+      </w:r>
+    </w:p>
+    <w:p>
+      <w:pPr>
+        <w:rPr>
+          <w:sz w:val="28"/>
+          <w:szCs w:val="28"/>
+          <w:lang w:val="en-IN"/>
+        </w:rPr>
+      </w:pPr>
+      <w:r>
+        <w:rPr>
+          <w:sz w:val="28"/>
+          <w:szCs w:val="28"/>
           <w:lang w:val="en-IN"/>
         </w:rPr>
         <w:pict w14:anchorId="017BFACA">
-          <v:rect id="_x0000_i1138" style="width:0;height:1.5pt" o:hralign="center" o:hrstd="t" o:hr="t" fillcolor="#a0a0a0" stroked="f"/>
+          <v:rect id="_x0000_i1026" style="width:0;height:1.5pt" o:hralign="center" o:hrstd="t" o:hr="t" fillcolor="#a0a0a0" stroked="f"/>
         </w:pict>
       </w:r>
     </w:p>
@@ -779,6 +1227,8 @@
         <w:rPr>
           <w:b/>
           <w:bCs/>
+          <w:sz w:val="28"/>
+          <w:szCs w:val="28"/>
           <w:lang w:val="en-IN"/>
         </w:rPr>
       </w:pPr>
@@ -787,6 +1237,8 @@
           <w:rFonts w:ascii="Segoe UI Emoji" w:hAnsi="Segoe UI Emoji" w:cs="Segoe UI Emoji"/>
           <w:b/>
           <w:bCs/>
+          <w:sz w:val="28"/>
+          <w:szCs w:val="28"/>
           <w:lang w:val="en-IN"/>
         </w:rPr>
         <w:t>🟩</w:t>
@@ -795,6 +1247,8 @@
         <w:rPr>
           <w:b/>
           <w:bCs/>
+          <w:sz w:val="28"/>
+          <w:szCs w:val="28"/>
           <w:lang w:val="en-IN"/>
         </w:rPr>
         <w:t xml:space="preserve"> Problem Statement</w:t>
@@ -803,11 +1257,15 @@
     <w:p>
       <w:pPr>
         <w:rPr>
-          <w:lang w:val="en-IN"/>
-        </w:rPr>
-      </w:pPr>
-      <w:r>
-        <w:rPr>
+          <w:sz w:val="28"/>
+          <w:szCs w:val="28"/>
+          <w:lang w:val="en-IN"/>
+        </w:rPr>
+      </w:pPr>
+      <w:r>
+        <w:rPr>
+          <w:sz w:val="28"/>
+          <w:szCs w:val="28"/>
           <w:lang w:val="en-IN"/>
         </w:rPr>
         <w:t>Retail businesses often struggle to analyze large amounts of sales data efficiently. There is a need for a system that can track sales performance, identify trends, and support data-driven decision-making.</w:t>
@@ -816,15 +1274,19 @@
     <w:p>
       <w:pPr>
         <w:rPr>
-          <w:lang w:val="en-IN"/>
-        </w:rPr>
-      </w:pPr>
-      <w:r>
-        <w:rPr>
+          <w:sz w:val="28"/>
+          <w:szCs w:val="28"/>
+          <w:lang w:val="en-IN"/>
+        </w:rPr>
+      </w:pPr>
+      <w:r>
+        <w:rPr>
+          <w:sz w:val="28"/>
+          <w:szCs w:val="28"/>
           <w:lang w:val="en-IN"/>
         </w:rPr>
         <w:pict w14:anchorId="0C50D534">
-          <v:rect id="_x0000_i1139" style="width:0;height:1.5pt" o:hralign="center" o:hrstd="t" o:hr="t" fillcolor="#a0a0a0" stroked="f"/>
+          <v:rect id="_x0000_i1027" style="width:0;height:1.5pt" o:hralign="center" o:hrstd="t" o:hr="t" fillcolor="#a0a0a0" stroked="f"/>
         </w:pict>
       </w:r>
     </w:p>
@@ -833,6 +1295,8 @@
         <w:rPr>
           <w:b/>
           <w:bCs/>
+          <w:sz w:val="28"/>
+          <w:szCs w:val="28"/>
           <w:lang w:val="en-IN"/>
         </w:rPr>
       </w:pPr>
@@ -841,6 +1305,8 @@
           <w:rFonts w:ascii="Segoe UI Emoji" w:hAnsi="Segoe UI Emoji" w:cs="Segoe UI Emoji"/>
           <w:b/>
           <w:bCs/>
+          <w:sz w:val="28"/>
+          <w:szCs w:val="28"/>
           <w:lang w:val="en-IN"/>
         </w:rPr>
         <w:t>🟩</w:t>
@@ -849,6 +1315,8 @@
         <w:rPr>
           <w:b/>
           <w:bCs/>
+          <w:sz w:val="28"/>
+          <w:szCs w:val="28"/>
           <w:lang w:val="en-IN"/>
         </w:rPr>
         <w:t xml:space="preserve"> Existing Approaches</w:t>
@@ -857,11 +1325,15 @@
     <w:p>
       <w:pPr>
         <w:rPr>
-          <w:lang w:val="en-IN"/>
-        </w:rPr>
-      </w:pPr>
-      <w:r>
-        <w:rPr>
+          <w:sz w:val="28"/>
+          <w:szCs w:val="28"/>
+          <w:lang w:val="en-IN"/>
+        </w:rPr>
+      </w:pPr>
+      <w:r>
+        <w:rPr>
+          <w:sz w:val="28"/>
+          <w:szCs w:val="28"/>
           <w:lang w:val="en-IN"/>
         </w:rPr>
         <w:t>Traditional methods like manual Excel analysis are time-consuming and less efficient. Many businesses lack proper visualization tools, making it difficult to interpret data quickly.</w:t>
@@ -870,15 +1342,19 @@
     <w:p>
       <w:pPr>
         <w:rPr>
-          <w:lang w:val="en-IN"/>
-        </w:rPr>
-      </w:pPr>
-      <w:r>
-        <w:rPr>
+          <w:sz w:val="28"/>
+          <w:szCs w:val="28"/>
+          <w:lang w:val="en-IN"/>
+        </w:rPr>
+      </w:pPr>
+      <w:r>
+        <w:rPr>
+          <w:sz w:val="28"/>
+          <w:szCs w:val="28"/>
           <w:lang w:val="en-IN"/>
         </w:rPr>
         <w:pict w14:anchorId="140FD9C0">
-          <v:rect id="_x0000_i1140" style="width:0;height:1.5pt" o:hralign="center" o:hrstd="t" o:hr="t" fillcolor="#a0a0a0" stroked="f"/>
+          <v:rect id="_x0000_i1028" style="width:0;height:1.5pt" o:hralign="center" o:hrstd="t" o:hr="t" fillcolor="#a0a0a0" stroked="f"/>
         </w:pict>
       </w:r>
     </w:p>
@@ -887,6 +1363,8 @@
         <w:rPr>
           <w:b/>
           <w:bCs/>
+          <w:sz w:val="28"/>
+          <w:szCs w:val="28"/>
           <w:lang w:val="en-IN"/>
         </w:rPr>
       </w:pPr>
@@ -895,6 +1373,8 @@
           <w:rFonts w:ascii="Segoe UI Emoji" w:hAnsi="Segoe UI Emoji" w:cs="Segoe UI Emoji"/>
           <w:b/>
           <w:bCs/>
+          <w:sz w:val="28"/>
+          <w:szCs w:val="28"/>
           <w:lang w:val="en-IN"/>
         </w:rPr>
         <w:t>🟩</w:t>
@@ -903,6 +1383,8 @@
         <w:rPr>
           <w:b/>
           <w:bCs/>
+          <w:sz w:val="28"/>
+          <w:szCs w:val="28"/>
           <w:lang w:val="en-IN"/>
         </w:rPr>
         <w:t xml:space="preserve"> Approach / Methodology</w:t>
@@ -911,17 +1393,23 @@
     <w:p>
       <w:pPr>
         <w:rPr>
-          <w:lang w:val="en-IN"/>
-        </w:rPr>
-      </w:pPr>
-      <w:r>
-        <w:rPr>
+          <w:sz w:val="28"/>
+          <w:szCs w:val="28"/>
+          <w:lang w:val="en-IN"/>
+        </w:rPr>
+      </w:pPr>
+      <w:r>
+        <w:rPr>
+          <w:sz w:val="28"/>
+          <w:szCs w:val="28"/>
           <w:lang w:val="en-IN"/>
         </w:rPr>
         <w:t>The project follows a structured approach:</w:t>
       </w:r>
       <w:r>
         <w:rPr>
+          <w:sz w:val="28"/>
+          <w:szCs w:val="28"/>
           <w:lang w:val="en-IN"/>
         </w:rPr>
         <w:br/>
@@ -929,6 +1417,8 @@
       </w:r>
       <w:r>
         <w:rPr>
+          <w:sz w:val="28"/>
+          <w:szCs w:val="28"/>
           <w:lang w:val="en-IN"/>
         </w:rPr>
         <w:br/>
@@ -936,6 +1426,8 @@
       </w:r>
       <w:r>
         <w:rPr>
+          <w:sz w:val="28"/>
+          <w:szCs w:val="28"/>
           <w:lang w:val="en-IN"/>
         </w:rPr>
         <w:br/>
@@ -943,6 +1435,8 @@
       </w:r>
       <w:r>
         <w:rPr>
+          <w:sz w:val="28"/>
+          <w:szCs w:val="28"/>
           <w:lang w:val="en-IN"/>
         </w:rPr>
         <w:br/>
@@ -952,15 +1446,20 @@
     <w:p>
       <w:pPr>
         <w:rPr>
-          <w:lang w:val="en-IN"/>
-        </w:rPr>
-      </w:pPr>
-      <w:r>
-        <w:rPr>
-          <w:lang w:val="en-IN"/>
-        </w:rPr>
+          <w:sz w:val="28"/>
+          <w:szCs w:val="28"/>
+          <w:lang w:val="en-IN"/>
+        </w:rPr>
+      </w:pPr>
+      <w:r>
+        <w:rPr>
+          <w:sz w:val="28"/>
+          <w:szCs w:val="28"/>
+          <w:lang w:val="en-IN"/>
+        </w:rPr>
+        <w:lastRenderedPageBreak/>
         <w:pict w14:anchorId="3F216006">
-          <v:rect id="_x0000_i1141" style="width:0;height:1.5pt" o:hralign="center" o:hrstd="t" o:hr="t" fillcolor="#a0a0a0" stroked="f"/>
+          <v:rect id="_x0000_i1029" style="width:0;height:1.5pt" o:hralign="center" o:hrstd="t" o:hr="t" fillcolor="#a0a0a0" stroked="f"/>
         </w:pict>
       </w:r>
     </w:p>
@@ -969,6 +1468,8 @@
         <w:rPr>
           <w:b/>
           <w:bCs/>
+          <w:sz w:val="28"/>
+          <w:szCs w:val="28"/>
           <w:lang w:val="en-IN"/>
         </w:rPr>
       </w:pPr>
@@ -977,6 +1478,8 @@
           <w:rFonts w:ascii="Segoe UI Emoji" w:hAnsi="Segoe UI Emoji" w:cs="Segoe UI Emoji"/>
           <w:b/>
           <w:bCs/>
+          <w:sz w:val="28"/>
+          <w:szCs w:val="28"/>
           <w:lang w:val="en-IN"/>
         </w:rPr>
         <w:t>🟩</w:t>
@@ -985,6 +1488,8 @@
         <w:rPr>
           <w:b/>
           <w:bCs/>
+          <w:sz w:val="28"/>
+          <w:szCs w:val="28"/>
           <w:lang w:val="en-IN"/>
         </w:rPr>
         <w:t xml:space="preserve"> Workflow</w:t>
@@ -993,11 +1498,15 @@
     <w:p>
       <w:pPr>
         <w:rPr>
-          <w:lang w:val="en-IN"/>
-        </w:rPr>
-      </w:pPr>
-      <w:r>
-        <w:rPr>
+          <w:sz w:val="28"/>
+          <w:szCs w:val="28"/>
+          <w:lang w:val="en-IN"/>
+        </w:rPr>
+      </w:pPr>
+      <w:r>
+        <w:rPr>
+          <w:sz w:val="28"/>
+          <w:szCs w:val="28"/>
           <w:lang w:val="en-IN"/>
         </w:rPr>
         <w:t>Dataset → Data Cleaning → Data Analysis → Visualization → Dashboard → Insights</w:t>
@@ -1006,15 +1515,19 @@
     <w:p>
       <w:pPr>
         <w:rPr>
-          <w:lang w:val="en-IN"/>
-        </w:rPr>
-      </w:pPr>
-      <w:r>
-        <w:rPr>
+          <w:sz w:val="28"/>
+          <w:szCs w:val="28"/>
+          <w:lang w:val="en-IN"/>
+        </w:rPr>
+      </w:pPr>
+      <w:r>
+        <w:rPr>
+          <w:sz w:val="28"/>
+          <w:szCs w:val="28"/>
           <w:lang w:val="en-IN"/>
         </w:rPr>
         <w:pict w14:anchorId="7E6D8A06">
-          <v:rect id="_x0000_i1142" style="width:0;height:1.5pt" o:hralign="center" o:hrstd="t" o:hr="t" fillcolor="#a0a0a0" stroked="f"/>
+          <v:rect id="_x0000_i1030" style="width:0;height:1.5pt" o:hralign="center" o:hrstd="t" o:hr="t" fillcolor="#a0a0a0" stroked="f"/>
         </w:pict>
       </w:r>
     </w:p>
@@ -1023,6 +1536,8 @@
         <w:rPr>
           <w:b/>
           <w:bCs/>
+          <w:sz w:val="28"/>
+          <w:szCs w:val="28"/>
           <w:lang w:val="en-IN"/>
         </w:rPr>
       </w:pPr>
@@ -1031,6 +1546,8 @@
           <w:rFonts w:ascii="Segoe UI Emoji" w:hAnsi="Segoe UI Emoji" w:cs="Segoe UI Emoji"/>
           <w:b/>
           <w:bCs/>
+          <w:sz w:val="28"/>
+          <w:szCs w:val="28"/>
           <w:lang w:val="en-IN"/>
         </w:rPr>
         <w:t>🟩</w:t>
@@ -1039,6 +1556,8 @@
         <w:rPr>
           <w:b/>
           <w:bCs/>
+          <w:sz w:val="28"/>
+          <w:szCs w:val="28"/>
           <w:lang w:val="en-IN"/>
         </w:rPr>
         <w:t xml:space="preserve"> Assumptions</w:t>
@@ -1047,17 +1566,23 @@
     <w:p>
       <w:pPr>
         <w:rPr>
-          <w:lang w:val="en-IN"/>
-        </w:rPr>
-      </w:pPr>
-      <w:r>
-        <w:rPr>
+          <w:sz w:val="28"/>
+          <w:szCs w:val="28"/>
+          <w:lang w:val="en-IN"/>
+        </w:rPr>
+      </w:pPr>
+      <w:r>
+        <w:rPr>
+          <w:sz w:val="28"/>
+          <w:szCs w:val="28"/>
           <w:lang w:val="en-IN"/>
         </w:rPr>
         <w:t>- Dataset is accurate and reliable</w:t>
       </w:r>
       <w:r>
         <w:rPr>
+          <w:sz w:val="28"/>
+          <w:szCs w:val="28"/>
           <w:lang w:val="en-IN"/>
         </w:rPr>
         <w:br/>
@@ -1065,6 +1590,8 @@
       </w:r>
       <w:r>
         <w:rPr>
+          <w:sz w:val="28"/>
+          <w:szCs w:val="28"/>
           <w:lang w:val="en-IN"/>
         </w:rPr>
         <w:br/>
@@ -1074,16 +1601,19 @@
     <w:p>
       <w:pPr>
         <w:rPr>
-          <w:lang w:val="en-IN"/>
-        </w:rPr>
-      </w:pPr>
-      <w:r>
-        <w:rPr>
-          <w:lang w:val="en-IN"/>
-        </w:rPr>
-        <w:lastRenderedPageBreak/>
+          <w:sz w:val="28"/>
+          <w:szCs w:val="28"/>
+          <w:lang w:val="en-IN"/>
+        </w:rPr>
+      </w:pPr>
+      <w:r>
+        <w:rPr>
+          <w:sz w:val="28"/>
+          <w:szCs w:val="28"/>
+          <w:lang w:val="en-IN"/>
+        </w:rPr>
         <w:pict w14:anchorId="4B550768">
-          <v:rect id="_x0000_i1143" style="width:0;height:1.5pt" o:hralign="center" o:hrstd="t" o:hr="t" fillcolor="#a0a0a0" stroked="f"/>
+          <v:rect id="_x0000_i1031" style="width:0;height:1.5pt" o:hralign="center" o:hrstd="t" o:hr="t" fillcolor="#a0a0a0" stroked="f"/>
         </w:pict>
       </w:r>
     </w:p>
@@ -1092,6 +1622,8 @@
         <w:rPr>
           <w:b/>
           <w:bCs/>
+          <w:sz w:val="28"/>
+          <w:szCs w:val="28"/>
           <w:lang w:val="en-IN"/>
         </w:rPr>
       </w:pPr>
@@ -1100,6 +1632,8 @@
           <w:rFonts w:ascii="Segoe UI Emoji" w:hAnsi="Segoe UI Emoji" w:cs="Segoe UI Emoji"/>
           <w:b/>
           <w:bCs/>
+          <w:sz w:val="28"/>
+          <w:szCs w:val="28"/>
           <w:lang w:val="en-IN"/>
         </w:rPr>
         <w:t>🟩</w:t>
@@ -1108,6 +1642,8 @@
         <w:rPr>
           <w:b/>
           <w:bCs/>
+          <w:sz w:val="28"/>
+          <w:szCs w:val="28"/>
           <w:lang w:val="en-IN"/>
         </w:rPr>
         <w:t xml:space="preserve"> Implementation</w:t>
@@ -1116,23 +1652,31 @@
     <w:p>
       <w:pPr>
         <w:rPr>
-          <w:lang w:val="en-IN"/>
-        </w:rPr>
-      </w:pPr>
-      <w:r>
-        <w:rPr>
+          <w:sz w:val="28"/>
+          <w:szCs w:val="28"/>
+          <w:lang w:val="en-IN"/>
+        </w:rPr>
+      </w:pPr>
+      <w:r>
+        <w:rPr>
+          <w:sz w:val="28"/>
+          <w:szCs w:val="28"/>
           <w:lang w:val="en-IN"/>
         </w:rPr>
         <w:t>The dataset was loaded using Python and cleaned using Pandas. Missing values were checked and data types were corrected. Visualizations like line charts and bar charts were created to analyze trends.</w:t>
       </w:r>
       <w:r>
         <w:rPr>
+          <w:sz w:val="28"/>
+          <w:szCs w:val="28"/>
           <w:lang w:val="en-IN"/>
         </w:rPr>
         <w:br/>
       </w:r>
       <w:r>
         <w:rPr>
+          <w:sz w:val="28"/>
+          <w:szCs w:val="28"/>
           <w:lang w:val="en-IN"/>
         </w:rPr>
         <w:br/>
@@ -1140,6 +1684,8 @@
       </w:r>
       <w:r>
         <w:rPr>
+          <w:sz w:val="28"/>
+          <w:szCs w:val="28"/>
           <w:lang w:val="en-IN"/>
         </w:rPr>
         <w:br/>
@@ -1147,6 +1693,8 @@
       </w:r>
       <w:r>
         <w:rPr>
+          <w:sz w:val="28"/>
+          <w:szCs w:val="28"/>
           <w:lang w:val="en-IN"/>
         </w:rPr>
         <w:br/>
@@ -1154,6 +1702,8 @@
       </w:r>
       <w:r>
         <w:rPr>
+          <w:sz w:val="28"/>
+          <w:szCs w:val="28"/>
           <w:lang w:val="en-IN"/>
         </w:rPr>
         <w:br/>
@@ -1163,15 +1713,19 @@
     <w:p>
       <w:pPr>
         <w:rPr>
-          <w:lang w:val="en-IN"/>
-        </w:rPr>
-      </w:pPr>
-      <w:r>
-        <w:rPr>
+          <w:sz w:val="28"/>
+          <w:szCs w:val="28"/>
+          <w:lang w:val="en-IN"/>
+        </w:rPr>
+      </w:pPr>
+      <w:r>
+        <w:rPr>
+          <w:sz w:val="28"/>
+          <w:szCs w:val="28"/>
           <w:lang w:val="en-IN"/>
         </w:rPr>
         <w:pict w14:anchorId="180A0B1B">
-          <v:rect id="_x0000_i1144" style="width:0;height:1.5pt" o:hralign="center" o:hrstd="t" o:hr="t" fillcolor="#a0a0a0" stroked="f"/>
+          <v:rect id="_x0000_i1032" style="width:0;height:1.5pt" o:hralign="center" o:hrstd="t" o:hr="t" fillcolor="#a0a0a0" stroked="f"/>
         </w:pict>
       </w:r>
     </w:p>
@@ -1180,6 +1734,8 @@
         <w:rPr>
           <w:b/>
           <w:bCs/>
+          <w:sz w:val="28"/>
+          <w:szCs w:val="28"/>
           <w:lang w:val="en-IN"/>
         </w:rPr>
       </w:pPr>
@@ -1188,6 +1744,8 @@
           <w:rFonts w:ascii="Segoe UI Emoji" w:hAnsi="Segoe UI Emoji" w:cs="Segoe UI Emoji"/>
           <w:b/>
           <w:bCs/>
+          <w:sz w:val="28"/>
+          <w:szCs w:val="28"/>
           <w:lang w:val="en-IN"/>
         </w:rPr>
         <w:t>🟩</w:t>
@@ -1196,6 +1754,8 @@
         <w:rPr>
           <w:b/>
           <w:bCs/>
+          <w:sz w:val="28"/>
+          <w:szCs w:val="28"/>
           <w:lang w:val="en-IN"/>
         </w:rPr>
         <w:t xml:space="preserve"> Solution Design</w:t>
@@ -1204,17 +1764,23 @@
     <w:p>
       <w:pPr>
         <w:rPr>
-          <w:lang w:val="en-IN"/>
-        </w:rPr>
-      </w:pPr>
-      <w:r>
-        <w:rPr>
+          <w:sz w:val="28"/>
+          <w:szCs w:val="28"/>
+          <w:lang w:val="en-IN"/>
+        </w:rPr>
+      </w:pPr>
+      <w:r>
+        <w:rPr>
+          <w:sz w:val="28"/>
+          <w:szCs w:val="28"/>
           <w:lang w:val="en-IN"/>
         </w:rPr>
         <w:t>The system consists of:</w:t>
       </w:r>
       <w:r>
         <w:rPr>
+          <w:sz w:val="28"/>
+          <w:szCs w:val="28"/>
           <w:lang w:val="en-IN"/>
         </w:rPr>
         <w:br/>
@@ -1222,6 +1788,8 @@
       </w:r>
       <w:r>
         <w:rPr>
+          <w:sz w:val="28"/>
+          <w:szCs w:val="28"/>
           <w:lang w:val="en-IN"/>
         </w:rPr>
         <w:br/>
@@ -1229,6 +1797,8 @@
       </w:r>
       <w:r>
         <w:rPr>
+          <w:sz w:val="28"/>
+          <w:szCs w:val="28"/>
           <w:lang w:val="en-IN"/>
         </w:rPr>
         <w:br/>
@@ -1236,12 +1806,16 @@
       </w:r>
       <w:r>
         <w:rPr>
+          <w:sz w:val="28"/>
+          <w:szCs w:val="28"/>
           <w:lang w:val="en-IN"/>
         </w:rPr>
         <w:br/>
       </w:r>
       <w:r>
         <w:rPr>
+          <w:sz w:val="28"/>
+          <w:szCs w:val="28"/>
           <w:lang w:val="en-IN"/>
         </w:rPr>
         <w:br/>
@@ -1251,15 +1825,19 @@
     <w:p>
       <w:pPr>
         <w:rPr>
-          <w:lang w:val="en-IN"/>
-        </w:rPr>
-      </w:pPr>
-      <w:r>
-        <w:rPr>
+          <w:sz w:val="28"/>
+          <w:szCs w:val="28"/>
+          <w:lang w:val="en-IN"/>
+        </w:rPr>
+      </w:pPr>
+      <w:r>
+        <w:rPr>
+          <w:sz w:val="28"/>
+          <w:szCs w:val="28"/>
           <w:lang w:val="en-IN"/>
         </w:rPr>
         <w:pict w14:anchorId="5458DAFB">
-          <v:rect id="_x0000_i1145" style="width:0;height:1.5pt" o:hralign="center" o:hrstd="t" o:hr="t" fillcolor="#a0a0a0" stroked="f"/>
+          <v:rect id="_x0000_i1033" style="width:0;height:1.5pt" o:hralign="center" o:hrstd="t" o:hr="t" fillcolor="#a0a0a0" stroked="f"/>
         </w:pict>
       </w:r>
     </w:p>
@@ -1268,6 +1846,8 @@
         <w:rPr>
           <w:b/>
           <w:bCs/>
+          <w:sz w:val="28"/>
+          <w:szCs w:val="28"/>
           <w:lang w:val="en-IN"/>
         </w:rPr>
       </w:pPr>
@@ -1276,6 +1856,8 @@
           <w:rFonts w:ascii="Segoe UI Emoji" w:hAnsi="Segoe UI Emoji" w:cs="Segoe UI Emoji"/>
           <w:b/>
           <w:bCs/>
+          <w:sz w:val="28"/>
+          <w:szCs w:val="28"/>
           <w:lang w:val="en-IN"/>
         </w:rPr>
         <w:t>🟩</w:t>
@@ -1284,6 +1866,8 @@
         <w:rPr>
           <w:b/>
           <w:bCs/>
+          <w:sz w:val="28"/>
+          <w:szCs w:val="28"/>
           <w:lang w:val="en-IN"/>
         </w:rPr>
         <w:t xml:space="preserve"> Challenges &amp; Opportunities</w:t>
@@ -1292,17 +1876,24 @@
     <w:p>
       <w:pPr>
         <w:rPr>
-          <w:lang w:val="en-IN"/>
-        </w:rPr>
-      </w:pPr>
-      <w:r>
-        <w:rPr>
-          <w:lang w:val="en-IN"/>
-        </w:rPr>
+          <w:sz w:val="28"/>
+          <w:szCs w:val="28"/>
+          <w:lang w:val="en-IN"/>
+        </w:rPr>
+      </w:pPr>
+      <w:r>
+        <w:rPr>
+          <w:sz w:val="28"/>
+          <w:szCs w:val="28"/>
+          <w:lang w:val="en-IN"/>
+        </w:rPr>
+        <w:lastRenderedPageBreak/>
         <w:t>Challenges:</w:t>
       </w:r>
       <w:r>
         <w:rPr>
+          <w:sz w:val="28"/>
+          <w:szCs w:val="28"/>
           <w:lang w:val="en-IN"/>
         </w:rPr>
         <w:br/>
@@ -1310,6 +1901,8 @@
       </w:r>
       <w:r>
         <w:rPr>
+          <w:sz w:val="28"/>
+          <w:szCs w:val="28"/>
           <w:lang w:val="en-IN"/>
         </w:rPr>
         <w:br/>
@@ -1317,12 +1910,16 @@
       </w:r>
       <w:r>
         <w:rPr>
+          <w:sz w:val="28"/>
+          <w:szCs w:val="28"/>
           <w:lang w:val="en-IN"/>
         </w:rPr>
         <w:br/>
       </w:r>
       <w:r>
         <w:rPr>
+          <w:sz w:val="28"/>
+          <w:szCs w:val="28"/>
           <w:lang w:val="en-IN"/>
         </w:rPr>
         <w:br/>
@@ -1330,6 +1927,8 @@
       </w:r>
       <w:r>
         <w:rPr>
+          <w:sz w:val="28"/>
+          <w:szCs w:val="28"/>
           <w:lang w:val="en-IN"/>
         </w:rPr>
         <w:br/>
@@ -1337,6 +1936,8 @@
       </w:r>
       <w:r>
         <w:rPr>
+          <w:sz w:val="28"/>
+          <w:szCs w:val="28"/>
           <w:lang w:val="en-IN"/>
         </w:rPr>
         <w:br/>
@@ -1346,15 +1947,19 @@
     <w:p>
       <w:pPr>
         <w:rPr>
-          <w:lang w:val="en-IN"/>
-        </w:rPr>
-      </w:pPr>
-      <w:r>
-        <w:rPr>
+          <w:sz w:val="28"/>
+          <w:szCs w:val="28"/>
+          <w:lang w:val="en-IN"/>
+        </w:rPr>
+      </w:pPr>
+      <w:r>
+        <w:rPr>
+          <w:sz w:val="28"/>
+          <w:szCs w:val="28"/>
           <w:lang w:val="en-IN"/>
         </w:rPr>
         <w:pict w14:anchorId="6FD5B6A8">
-          <v:rect id="_x0000_i1146" style="width:0;height:1.5pt" o:hralign="center" o:hrstd="t" o:hr="t" fillcolor="#a0a0a0" stroked="f"/>
+          <v:rect id="_x0000_i1034" style="width:0;height:1.5pt" o:hralign="center" o:hrstd="t" o:hr="t" fillcolor="#a0a0a0" stroked="f"/>
         </w:pict>
       </w:r>
     </w:p>
@@ -1363,6 +1968,8 @@
         <w:rPr>
           <w:b/>
           <w:bCs/>
+          <w:sz w:val="28"/>
+          <w:szCs w:val="28"/>
           <w:lang w:val="en-IN"/>
         </w:rPr>
       </w:pPr>
@@ -1371,6 +1978,8 @@
           <w:rFonts w:ascii="Segoe UI Emoji" w:hAnsi="Segoe UI Emoji" w:cs="Segoe UI Emoji"/>
           <w:b/>
           <w:bCs/>
+          <w:sz w:val="28"/>
+          <w:szCs w:val="28"/>
           <w:lang w:val="en-IN"/>
         </w:rPr>
         <w:t>🟩</w:t>
@@ -1379,6 +1988,8 @@
         <w:rPr>
           <w:b/>
           <w:bCs/>
+          <w:sz w:val="28"/>
+          <w:szCs w:val="28"/>
           <w:lang w:val="en-IN"/>
         </w:rPr>
         <w:t xml:space="preserve"> Reflections</w:t>
@@ -1387,11 +1998,15 @@
     <w:p>
       <w:pPr>
         <w:rPr>
-          <w:lang w:val="en-IN"/>
-        </w:rPr>
-      </w:pPr>
-      <w:r>
-        <w:rPr>
+          <w:sz w:val="28"/>
+          <w:szCs w:val="28"/>
+          <w:lang w:val="en-IN"/>
+        </w:rPr>
+      </w:pPr>
+      <w:r>
+        <w:rPr>
+          <w:sz w:val="28"/>
+          <w:szCs w:val="28"/>
           <w:lang w:val="en-IN"/>
         </w:rPr>
         <w:t>This project enhanced my understanding of data analytics, visualization, and business insights. I gained hands-on experience with Python and Power BI.</w:t>
@@ -1400,15 +2015,19 @@
     <w:p>
       <w:pPr>
         <w:rPr>
-          <w:lang w:val="en-IN"/>
-        </w:rPr>
-      </w:pPr>
-      <w:r>
-        <w:rPr>
+          <w:sz w:val="28"/>
+          <w:szCs w:val="28"/>
+          <w:lang w:val="en-IN"/>
+        </w:rPr>
+      </w:pPr>
+      <w:r>
+        <w:rPr>
+          <w:sz w:val="28"/>
+          <w:szCs w:val="28"/>
           <w:lang w:val="en-IN"/>
         </w:rPr>
         <w:pict w14:anchorId="74CD4550">
-          <v:rect id="_x0000_i1147" style="width:0;height:1.5pt" o:hralign="center" o:hrstd="t" o:hr="t" fillcolor="#a0a0a0" stroked="f"/>
+          <v:rect id="_x0000_i1035" style="width:0;height:1.5pt" o:hralign="center" o:hrstd="t" o:hr="t" fillcolor="#a0a0a0" stroked="f"/>
         </w:pict>
       </w:r>
     </w:p>
@@ -1417,6 +2036,8 @@
         <w:rPr>
           <w:b/>
           <w:bCs/>
+          <w:sz w:val="28"/>
+          <w:szCs w:val="28"/>
           <w:lang w:val="en-IN"/>
         </w:rPr>
       </w:pPr>
@@ -1425,6 +2046,8 @@
           <w:rFonts w:ascii="Segoe UI Emoji" w:hAnsi="Segoe UI Emoji" w:cs="Segoe UI Emoji"/>
           <w:b/>
           <w:bCs/>
+          <w:sz w:val="28"/>
+          <w:szCs w:val="28"/>
           <w:lang w:val="en-IN"/>
         </w:rPr>
         <w:t>🟩</w:t>
@@ -1433,6 +2056,8 @@
         <w:rPr>
           <w:b/>
           <w:bCs/>
+          <w:sz w:val="28"/>
+          <w:szCs w:val="28"/>
           <w:lang w:val="en-IN"/>
         </w:rPr>
         <w:t xml:space="preserve"> Recommendations</w:t>
@@ -1441,17 +2066,23 @@
     <w:p>
       <w:pPr>
         <w:rPr>
-          <w:lang w:val="en-IN"/>
-        </w:rPr>
-      </w:pPr>
-      <w:r>
-        <w:rPr>
+          <w:sz w:val="28"/>
+          <w:szCs w:val="28"/>
+          <w:lang w:val="en-IN"/>
+        </w:rPr>
+      </w:pPr>
+      <w:r>
+        <w:rPr>
+          <w:sz w:val="28"/>
+          <w:szCs w:val="28"/>
           <w:lang w:val="en-IN"/>
         </w:rPr>
         <w:t>- Use real-time data for better insights</w:t>
       </w:r>
       <w:r>
         <w:rPr>
+          <w:sz w:val="28"/>
+          <w:szCs w:val="28"/>
           <w:lang w:val="en-IN"/>
         </w:rPr>
         <w:br/>
@@ -1459,6 +2090,8 @@
       </w:r>
       <w:r>
         <w:rPr>
+          <w:sz w:val="28"/>
+          <w:szCs w:val="28"/>
           <w:lang w:val="en-IN"/>
         </w:rPr>
         <w:br/>
@@ -1468,16 +2101,19 @@
     <w:p>
       <w:pPr>
         <w:rPr>
-          <w:lang w:val="en-IN"/>
-        </w:rPr>
-      </w:pPr>
-      <w:r>
-        <w:rPr>
-          <w:lang w:val="en-IN"/>
-        </w:rPr>
-        <w:lastRenderedPageBreak/>
+          <w:sz w:val="28"/>
+          <w:szCs w:val="28"/>
+          <w:lang w:val="en-IN"/>
+        </w:rPr>
+      </w:pPr>
+      <w:r>
+        <w:rPr>
+          <w:sz w:val="28"/>
+          <w:szCs w:val="28"/>
+          <w:lang w:val="en-IN"/>
+        </w:rPr>
         <w:pict w14:anchorId="01E8F8B1">
-          <v:rect id="_x0000_i1148" style="width:0;height:1.5pt" o:hralign="center" o:hrstd="t" o:hr="t" fillcolor="#a0a0a0" stroked="f"/>
+          <v:rect id="_x0000_i1036" style="width:0;height:1.5pt" o:hralign="center" o:hrstd="t" o:hr="t" fillcolor="#a0a0a0" stroked="f"/>
         </w:pict>
       </w:r>
     </w:p>
@@ -1486,6 +2122,8 @@
         <w:rPr>
           <w:b/>
           <w:bCs/>
+          <w:sz w:val="28"/>
+          <w:szCs w:val="28"/>
           <w:lang w:val="en-IN"/>
         </w:rPr>
       </w:pPr>
@@ -1494,6 +2132,8 @@
           <w:rFonts w:ascii="Segoe UI Emoji" w:hAnsi="Segoe UI Emoji" w:cs="Segoe UI Emoji"/>
           <w:b/>
           <w:bCs/>
+          <w:sz w:val="28"/>
+          <w:szCs w:val="28"/>
           <w:lang w:val="en-IN"/>
         </w:rPr>
         <w:t>🟩</w:t>
@@ -1502,6 +2142,8 @@
         <w:rPr>
           <w:b/>
           <w:bCs/>
+          <w:sz w:val="28"/>
+          <w:szCs w:val="28"/>
           <w:lang w:val="en-IN"/>
         </w:rPr>
         <w:t xml:space="preserve"> Outcome / Conclusion</w:t>
@@ -1510,11 +2152,15 @@
     <w:p>
       <w:pPr>
         <w:rPr>
-          <w:lang w:val="en-IN"/>
-        </w:rPr>
-      </w:pPr>
-      <w:r>
-        <w:rPr>
+          <w:sz w:val="28"/>
+          <w:szCs w:val="28"/>
+          <w:lang w:val="en-IN"/>
+        </w:rPr>
+      </w:pPr>
+      <w:r>
+        <w:rPr>
+          <w:sz w:val="28"/>
+          <w:szCs w:val="28"/>
           <w:lang w:val="en-IN"/>
         </w:rPr>
         <w:t>The project successfully developed a retail sales monitoring system. It helps in understanding sales trends, product performance, and supports better decision-making.</w:t>
@@ -1523,15 +2169,19 @@
     <w:p>
       <w:pPr>
         <w:rPr>
-          <w:lang w:val="en-IN"/>
-        </w:rPr>
-      </w:pPr>
-      <w:r>
-        <w:rPr>
+          <w:sz w:val="28"/>
+          <w:szCs w:val="28"/>
+          <w:lang w:val="en-IN"/>
+        </w:rPr>
+      </w:pPr>
+      <w:r>
+        <w:rPr>
+          <w:sz w:val="28"/>
+          <w:szCs w:val="28"/>
           <w:lang w:val="en-IN"/>
         </w:rPr>
         <w:pict w14:anchorId="61993DB2">
-          <v:rect id="_x0000_i1149" style="width:0;height:1.5pt" o:hralign="center" o:hrstd="t" o:hr="t" fillcolor="#a0a0a0" stroked="f"/>
+          <v:rect id="_x0000_i1037" style="width:0;height:1.5pt" o:hralign="center" o:hrstd="t" o:hr="t" fillcolor="#a0a0a0" stroked="f"/>
         </w:pict>
       </w:r>
     </w:p>
@@ -1540,6 +2190,8 @@
         <w:rPr>
           <w:b/>
           <w:bCs/>
+          <w:sz w:val="28"/>
+          <w:szCs w:val="28"/>
           <w:lang w:val="en-IN"/>
         </w:rPr>
       </w:pPr>
@@ -1548,6 +2200,8 @@
           <w:rFonts w:ascii="Segoe UI Emoji" w:hAnsi="Segoe UI Emoji" w:cs="Segoe UI Emoji"/>
           <w:b/>
           <w:bCs/>
+          <w:sz w:val="28"/>
+          <w:szCs w:val="28"/>
           <w:lang w:val="en-IN"/>
         </w:rPr>
         <w:t>🟩</w:t>
@@ -1556,6 +2210,8 @@
         <w:rPr>
           <w:b/>
           <w:bCs/>
+          <w:sz w:val="28"/>
+          <w:szCs w:val="28"/>
           <w:lang w:val="en-IN"/>
         </w:rPr>
         <w:t xml:space="preserve"> Enhancement Scope</w:t>
@@ -1564,17 +2220,23 @@
     <w:p>
       <w:pPr>
         <w:rPr>
-          <w:lang w:val="en-IN"/>
-        </w:rPr>
-      </w:pPr>
-      <w:r>
-        <w:rPr>
+          <w:sz w:val="28"/>
+          <w:szCs w:val="28"/>
+          <w:lang w:val="en-IN"/>
+        </w:rPr>
+      </w:pPr>
+      <w:r>
+        <w:rPr>
+          <w:sz w:val="28"/>
+          <w:szCs w:val="28"/>
           <w:lang w:val="en-IN"/>
         </w:rPr>
         <w:t>- Add machine learning for prediction</w:t>
       </w:r>
       <w:r>
         <w:rPr>
+          <w:sz w:val="28"/>
+          <w:szCs w:val="28"/>
           <w:lang w:val="en-IN"/>
         </w:rPr>
         <w:br/>
@@ -1582,6 +2244,8 @@
       </w:r>
       <w:r>
         <w:rPr>
+          <w:sz w:val="28"/>
+          <w:szCs w:val="28"/>
           <w:lang w:val="en-IN"/>
         </w:rPr>
         <w:br/>
@@ -1591,23 +2255,38 @@
     <w:p>
       <w:pPr>
         <w:rPr>
-          <w:lang w:val="en-IN"/>
-        </w:rPr>
-      </w:pPr>
-      <w:r>
-        <w:rPr>
+          <w:sz w:val="28"/>
+          <w:szCs w:val="28"/>
+          <w:lang w:val="en-IN"/>
+        </w:rPr>
+      </w:pPr>
+      <w:r>
+        <w:rPr>
+          <w:sz w:val="28"/>
+          <w:szCs w:val="28"/>
           <w:lang w:val="en-IN"/>
         </w:rPr>
         <w:pict w14:anchorId="4EE0B3A0">
-          <v:rect id="_x0000_i1150" style="width:0;height:1.5pt" o:hralign="center" o:hrstd="t" o:hr="t" fillcolor="#a0a0a0" stroked="f"/>
+          <v:rect id="_x0000_i1395" style="width:0;height:1.5pt" o:hralign="center" o:bullet="t" o:hrstd="t" o:hr="t" fillcolor="#a0a0a0" stroked="f"/>
         </w:pict>
       </w:r>
+    </w:p>
+    <w:p>
+      <w:pPr>
+        <w:rPr>
+          <w:sz w:val="28"/>
+          <w:szCs w:val="28"/>
+          <w:lang w:val="en-IN"/>
+        </w:rPr>
+      </w:pPr>
     </w:p>
     <w:p>
       <w:pPr>
         <w:rPr>
           <w:b/>
           <w:bCs/>
+          <w:sz w:val="28"/>
+          <w:szCs w:val="28"/>
           <w:lang w:val="en-IN"/>
         </w:rPr>
       </w:pPr>
@@ -1616,14 +2295,19 @@
           <w:rFonts w:ascii="Segoe UI Emoji" w:hAnsi="Segoe UI Emoji" w:cs="Segoe UI Emoji"/>
           <w:b/>
           <w:bCs/>
-          <w:lang w:val="en-IN"/>
-        </w:rPr>
+          <w:sz w:val="28"/>
+          <w:szCs w:val="28"/>
+          <w:lang w:val="en-IN"/>
+        </w:rPr>
+        <w:lastRenderedPageBreak/>
         <w:t>🟩</w:t>
       </w:r>
       <w:r>
         <w:rPr>
           <w:b/>
           <w:bCs/>
+          <w:sz w:val="28"/>
+          <w:szCs w:val="28"/>
           <w:lang w:val="en-IN"/>
         </w:rPr>
         <w:t xml:space="preserve"> Link to Code</w:t>
@@ -1632,28 +2316,52 @@
     <w:p>
       <w:pPr>
         <w:rPr>
-          <w:lang w:val="en-IN"/>
-        </w:rPr>
-      </w:pPr>
-      <w:r>
-        <w:rPr>
-          <w:lang w:val="en-IN"/>
-        </w:rPr>
-        <w:t>GitHub Link: [Add your repo link]</w:t>
-      </w:r>
-    </w:p>
-    <w:p>
-      <w:pPr>
-        <w:rPr>
-          <w:lang w:val="en-IN"/>
-        </w:rPr>
-      </w:pPr>
-      <w:r>
-        <w:rPr>
+          <w:sz w:val="28"/>
+          <w:szCs w:val="28"/>
+          <w:lang w:val="en-IN"/>
+        </w:rPr>
+      </w:pPr>
+      <w:r>
+        <w:rPr>
+          <w:sz w:val="28"/>
+          <w:szCs w:val="28"/>
+          <w:lang w:val="en-IN"/>
+        </w:rPr>
+        <w:t xml:space="preserve">GitHub Link: </w:t>
+      </w:r>
+      <w:r>
+        <w:rPr>
+          <w:sz w:val="28"/>
+          <w:szCs w:val="28"/>
+          <w:lang w:val="en-IN"/>
+        </w:rPr>
+        <w:t xml:space="preserve"> </w:t>
+      </w:r>
+      <w:r>
+        <w:rPr>
+          <w:sz w:val="28"/>
+          <w:szCs w:val="28"/>
+          <w:lang w:val="en-IN"/>
+        </w:rPr>
+        <w:t>https://github.com/AMITBAGADE21/TCS-ion-Integrated-Retail-Sales-Performance-Tracking-and-Analysis</w:t>
+      </w:r>
+    </w:p>
+    <w:p>
+      <w:pPr>
+        <w:rPr>
+          <w:sz w:val="28"/>
+          <w:szCs w:val="28"/>
+          <w:lang w:val="en-IN"/>
+        </w:rPr>
+      </w:pPr>
+      <w:r>
+        <w:rPr>
+          <w:sz w:val="28"/>
+          <w:szCs w:val="28"/>
           <w:lang w:val="en-IN"/>
         </w:rPr>
         <w:pict w14:anchorId="1D57E96D">
-          <v:rect id="_x0000_i1151" style="width:0;height:1.5pt" o:hralign="center" o:hrstd="t" o:hr="t" fillcolor="#a0a0a0" stroked="f"/>
+          <v:rect id="_x0000_i1039" style="width:0;height:1.5pt" o:hralign="center" o:hrstd="t" o:hr="t" fillcolor="#a0a0a0" stroked="f"/>
         </w:pict>
       </w:r>
     </w:p>
@@ -1662,6 +2370,8 @@
         <w:rPr>
           <w:b/>
           <w:bCs/>
+          <w:sz w:val="28"/>
+          <w:szCs w:val="28"/>
           <w:lang w:val="en-IN"/>
         </w:rPr>
       </w:pPr>
@@ -1670,6 +2380,8 @@
           <w:rFonts w:ascii="Segoe UI Emoji" w:hAnsi="Segoe UI Emoji" w:cs="Segoe UI Emoji"/>
           <w:b/>
           <w:bCs/>
+          <w:sz w:val="28"/>
+          <w:szCs w:val="28"/>
           <w:lang w:val="en-IN"/>
         </w:rPr>
         <w:t>🟩</w:t>
@@ -1678,6 +2390,8 @@
         <w:rPr>
           <w:b/>
           <w:bCs/>
+          <w:sz w:val="28"/>
+          <w:szCs w:val="28"/>
           <w:lang w:val="en-IN"/>
         </w:rPr>
         <w:t xml:space="preserve"> Research Questions</w:t>
@@ -1686,17 +2400,23 @@
     <w:p>
       <w:pPr>
         <w:rPr>
-          <w:lang w:val="en-IN"/>
-        </w:rPr>
-      </w:pPr>
-      <w:r>
-        <w:rPr>
+          <w:sz w:val="28"/>
+          <w:szCs w:val="28"/>
+          <w:lang w:val="en-IN"/>
+        </w:rPr>
+      </w:pPr>
+      <w:r>
+        <w:rPr>
+          <w:sz w:val="28"/>
+          <w:szCs w:val="28"/>
           <w:lang w:val="en-IN"/>
         </w:rPr>
         <w:t>Q1: Which product category performs best?</w:t>
       </w:r>
       <w:r>
         <w:rPr>
+          <w:sz w:val="28"/>
+          <w:szCs w:val="28"/>
           <w:lang w:val="en-IN"/>
         </w:rPr>
         <w:br/>
@@ -1704,12 +2424,16 @@
       </w:r>
       <w:r>
         <w:rPr>
+          <w:sz w:val="28"/>
+          <w:szCs w:val="28"/>
           <w:lang w:val="en-IN"/>
         </w:rPr>
         <w:br/>
       </w:r>
       <w:r>
         <w:rPr>
+          <w:sz w:val="28"/>
+          <w:szCs w:val="28"/>
           <w:lang w:val="en-IN"/>
         </w:rPr>
         <w:br/>
@@ -1717,6 +2441,8 @@
       </w:r>
       <w:r>
         <w:rPr>
+          <w:sz w:val="28"/>
+          <w:szCs w:val="28"/>
           <w:lang w:val="en-IN"/>
         </w:rPr>
         <w:br/>
@@ -1726,15 +2452,19 @@
     <w:p>
       <w:pPr>
         <w:rPr>
-          <w:lang w:val="en-IN"/>
-        </w:rPr>
-      </w:pPr>
-      <w:r>
-        <w:rPr>
+          <w:sz w:val="28"/>
+          <w:szCs w:val="28"/>
+          <w:lang w:val="en-IN"/>
+        </w:rPr>
+      </w:pPr>
+      <w:r>
+        <w:rPr>
+          <w:sz w:val="28"/>
+          <w:szCs w:val="28"/>
           <w:lang w:val="en-IN"/>
         </w:rPr>
         <w:pict w14:anchorId="50A2CE71">
-          <v:rect id="_x0000_i1152" style="width:0;height:1.5pt" o:hralign="center" o:hrstd="t" o:hr="t" fillcolor="#a0a0a0" stroked="f"/>
+          <v:rect id="_x0000_i1040" style="width:0;height:1.5pt" o:hralign="center" o:hrstd="t" o:hr="t" fillcolor="#a0a0a0" stroked="f"/>
         </w:pict>
       </w:r>
     </w:p>
@@ -1743,6 +2473,8 @@
         <w:rPr>
           <w:b/>
           <w:bCs/>
+          <w:sz w:val="28"/>
+          <w:szCs w:val="28"/>
           <w:lang w:val="en-IN"/>
         </w:rPr>
       </w:pPr>
@@ -1751,6 +2483,8 @@
           <w:rFonts w:ascii="Segoe UI Emoji" w:hAnsi="Segoe UI Emoji" w:cs="Segoe UI Emoji"/>
           <w:b/>
           <w:bCs/>
+          <w:sz w:val="28"/>
+          <w:szCs w:val="28"/>
           <w:lang w:val="en-IN"/>
         </w:rPr>
         <w:t>🟩</w:t>
@@ -1759,6 +2493,8 @@
         <w:rPr>
           <w:b/>
           <w:bCs/>
+          <w:sz w:val="28"/>
+          <w:szCs w:val="28"/>
           <w:lang w:val="en-IN"/>
         </w:rPr>
         <w:t xml:space="preserve"> References</w:t>
@@ -1767,17 +2503,23 @@
     <w:p>
       <w:pPr>
         <w:rPr>
-          <w:lang w:val="en-IN"/>
-        </w:rPr>
-      </w:pPr>
-      <w:r>
-        <w:rPr>
+          <w:sz w:val="28"/>
+          <w:szCs w:val="28"/>
+          <w:lang w:val="en-IN"/>
+        </w:rPr>
+      </w:pPr>
+      <w:r>
+        <w:rPr>
+          <w:sz w:val="28"/>
+          <w:szCs w:val="28"/>
           <w:lang w:val="en-IN"/>
         </w:rPr>
         <w:t>- Kaggle Dataset</w:t>
       </w:r>
       <w:r>
         <w:rPr>
+          <w:sz w:val="28"/>
+          <w:szCs w:val="28"/>
           <w:lang w:val="en-IN"/>
         </w:rPr>
         <w:br/>
@@ -1785,6 +2527,8 @@
       </w:r>
       <w:r>
         <w:rPr>
+          <w:sz w:val="28"/>
+          <w:szCs w:val="28"/>
           <w:lang w:val="en-IN"/>
         </w:rPr>
         <w:br/>
@@ -1792,9 +2536,17 @@
       </w:r>
     </w:p>
     <w:p>
+      <w:pPr>
+        <w:rPr>
+          <w:sz w:val="24"/>
+          <w:szCs w:val="24"/>
+        </w:rPr>
+      </w:pPr>
       <w:r>
         <w:rPr>
           <w:noProof/>
+          <w:sz w:val="24"/>
+          <w:szCs w:val="24"/>
         </w:rPr>
         <w:lastRenderedPageBreak/>
         <w:drawing>
@@ -1841,9 +2593,17 @@
       </w:r>
     </w:p>
     <w:p>
+      <w:pPr>
+        <w:rPr>
+          <w:sz w:val="24"/>
+          <w:szCs w:val="24"/>
+        </w:rPr>
+      </w:pPr>
       <w:r>
         <w:rPr>
           <w:noProof/>
+          <w:sz w:val="24"/>
+          <w:szCs w:val="24"/>
         </w:rPr>
         <w:drawing>
           <wp:inline distT="0" distB="0" distL="0" distR="0" wp14:anchorId="00991EC3" wp14:editId="7BC4CC5B">
@@ -2049,6 +2809,11 @@
 
 <file path=word/numbering.xml><?xml version="1.0" encoding="utf-8"?>
 <w:numbering xmlns:wpc="http://schemas.microsoft.com/office/word/2010/wordprocessingCanvas" xmlns:cx="http://schemas.microsoft.com/office/drawing/2014/chartex" xmlns:cx1="http://schemas.microsoft.com/office/drawing/2015/9/8/chartex" xmlns:cx2="http://schemas.microsoft.com/office/drawing/2015/10/21/chartex" xmlns:cx3="http://schemas.microsoft.com/office/drawing/2016/5/9/chartex" xmlns:cx4="http://schemas.microsoft.com/office/drawing/2016/5/10/chartex" xmlns:cx5="http://schemas.microsoft.com/office/drawing/2016/5/11/chartex" xmlns:cx6="http://schemas.microsoft.com/office/drawing/2016/5/12/chartex" xmlns:cx7="http://schemas.microsoft.com/office/drawing/2016/5/13/chartex" xmlns:cx8="http://schemas.microsoft.com/office/drawing/2016/5/14/chartex" xmlns:mc="http://schemas.openxmlformats.org/markup-compatibility/2006" xmlns:aink="http://schemas.microsoft.com/office/drawing/2016/ink" xmlns:am3d="http://schemas.microsoft.com/office/drawing/2017/model3d" xmlns:o="urn:schemas-microsoft-com:office:office" xmlns:oel="http://schemas.microsoft.com/office/2019/extlst" xmlns:r="http://schemas.openxmlformats.org/officeDocument/2006/relationships" xmlns:m="http://schemas.openxmlformats.org/officeDocument/2006/math" xmlns:v="urn:schemas-microsoft-com:vml" xmlns:wp14="http://schemas.microsoft.com/office/word/2010/wordprocessingDrawing" xmlns:wp="http://schemas.openxmlformats.org/drawingml/2006/wordprocessingDrawing" xmlns:w10="urn:schemas-microsoft-com:office:word" xmlns:w="http://schemas.openxmlformats.org/wordprocessingml/2006/main" xmlns:w14="http://schemas.microsoft.com/office/word/2010/wordml" xmlns:w15="http://schemas.microsoft.com/office/word/2012/wordml" xmlns:w16cex="http://schemas.microsoft.com/office/word/2018/wordml/cex" xmlns:w16cid="http://schemas.microsoft.com/office/word/2016/wordml/cid" xmlns:w16="http://schemas.microsoft.com/office/word/2018/wordml" xmlns:w16sdtdh="http://schemas.microsoft.com/office/word/2020/wordml/sdtdatahash" xmlns:w16se="http://schemas.microsoft.com/office/word/2015/wordml/symex" xmlns:wpg="http://schemas.microsoft.com/office/word/2010/wordprocessingGroup" xmlns:wpi="http://schemas.microsoft.com/office/word/2010/wordprocessingInk" xmlns:wne="http://schemas.microsoft.com/office/word/2006/wordml" xmlns:wps="http://schemas.microsoft.com/office/word/2010/wordprocessingShape" mc:Ignorable="w14 w15 w16se w16cid w16 w16cex w16sdtdh wp14">
+  <w:numPicBullet w:numPicBulletId="0">
+    <w:pict>
+      <v:rect id="_x0000_i1037" style="width:0;height:1.5pt" o:hralign="center" o:bullet="t" o:hrstd="t" o:hr="t" fillcolor="#a0a0a0" stroked="f"/>
+    </w:pict>
+  </w:numPicBullet>
   <w:abstractNum w:abstractNumId="0" w15:restartNumberingAfterBreak="0">
     <w:nsid w:val="02924C5B"/>
     <w:multiLevelType w:val="multilevel"/>
@@ -6370,6 +7135,7 @@
   <w:style w:type="character" w:default="1" w:styleId="DefaultParagraphFont">
     <w:name w:val="Default Paragraph Font"/>
     <w:uiPriority w:val="1"/>
+    <w:semiHidden/>
     <w:unhideWhenUsed/>
   </w:style>
   <w:style w:type="table" w:default="1" w:styleId="TableNormal">

</xml_diff>